<commit_message>
updating changes for Assignment7
</commit_message>
<xml_diff>
--- a/Assignment7/CSC500 Module 7 - Critical Thinking Assignment.docx
+++ b/Assignment7/CSC500 Module 7 - Critical Thinking Assignment.docx
@@ -2083,14 +2083,11 @@
     </w:p>
     <w:p>
       <w:r>
-        <w:rPr>
-          <w:noProof/>
-        </w:rPr>
         <w:drawing>
-          <wp:inline distT="0" distB="0" distL="0" distR="0" wp14:anchorId="2D638466" wp14:editId="56AABDAF">
-            <wp:extent cx="5943600" cy="3348355"/>
-            <wp:effectExtent l="0" t="0" r="0" b="4445"/>
-            <wp:docPr id="826829212" name="Picture 1"/>
+          <wp:inline distT="0" distB="0" distL="0" distR="0" wp14:anchorId="1A0E221D" wp14:editId="34785DD3">
+            <wp:extent cx="5943600" cy="2825750"/>
+            <wp:effectExtent l="0" t="0" r="0" b="0"/>
+            <wp:docPr id="1680512770" name="Picture 1"/>
             <wp:cNvGraphicFramePr>
               <a:graphicFrameLocks xmlns:a="http://schemas.openxmlformats.org/drawingml/2006/main" noChangeAspect="1"/>
             </wp:cNvGraphicFramePr>
@@ -2098,7 +2095,7 @@
               <a:graphicData uri="http://schemas.openxmlformats.org/drawingml/2006/picture">
                 <pic:pic xmlns:pic="http://schemas.openxmlformats.org/drawingml/2006/picture">
                   <pic:nvPicPr>
-                    <pic:cNvPr id="826829212" name=""/>
+                    <pic:cNvPr id="1680512770" name=""/>
                     <pic:cNvPicPr/>
                   </pic:nvPicPr>
                   <pic:blipFill>
@@ -2110,7 +2107,7 @@
                   <pic:spPr>
                     <a:xfrm>
                       <a:off x="0" y="0"/>
-                      <a:ext cx="5943600" cy="3348355"/>
+                      <a:ext cx="5943600" cy="2825750"/>
                     </a:xfrm>
                     <a:prstGeom prst="rect">
                       <a:avLst/>
@@ -2142,14 +2139,11 @@
     </w:p>
     <w:p>
       <w:r>
-        <w:rPr>
-          <w:noProof/>
-        </w:rPr>
         <w:drawing>
-          <wp:inline distT="0" distB="0" distL="0" distR="0" wp14:anchorId="489EA7EA" wp14:editId="2F7C0375">
-            <wp:extent cx="5943600" cy="1431925"/>
+          <wp:inline distT="0" distB="0" distL="0" distR="0" wp14:anchorId="68E23DA0" wp14:editId="0CFED1CF">
+            <wp:extent cx="5943600" cy="1774190"/>
             <wp:effectExtent l="0" t="0" r="0" b="0"/>
-            <wp:docPr id="1804916869" name="Picture 1"/>
+            <wp:docPr id="544222823" name="Picture 1"/>
             <wp:cNvGraphicFramePr>
               <a:graphicFrameLocks xmlns:a="http://schemas.openxmlformats.org/drawingml/2006/main" noChangeAspect="1"/>
             </wp:cNvGraphicFramePr>
@@ -2157,7 +2151,7 @@
               <a:graphicData uri="http://schemas.openxmlformats.org/drawingml/2006/picture">
                 <pic:pic xmlns:pic="http://schemas.openxmlformats.org/drawingml/2006/picture">
                   <pic:nvPicPr>
-                    <pic:cNvPr id="1804916869" name=""/>
+                    <pic:cNvPr id="544222823" name=""/>
                     <pic:cNvPicPr/>
                   </pic:nvPicPr>
                   <pic:blipFill>
@@ -2169,7 +2163,7 @@
                   <pic:spPr>
                     <a:xfrm>
                       <a:off x="0" y="0"/>
-                      <a:ext cx="5943600" cy="1431925"/>
+                      <a:ext cx="5943600" cy="1774190"/>
                     </a:xfrm>
                     <a:prstGeom prst="rect">
                       <a:avLst/>
@@ -2232,13 +2226,12 @@
         <w:rPr>
           <w:b/>
           <w:bCs/>
-          <w:noProof/>
         </w:rPr>
         <w:drawing>
-          <wp:inline distT="0" distB="0" distL="0" distR="0" wp14:anchorId="31875C9D" wp14:editId="2F773713">
-            <wp:extent cx="5943600" cy="1199515"/>
-            <wp:effectExtent l="0" t="0" r="0" b="635"/>
-            <wp:docPr id="157231826" name="Picture 1"/>
+          <wp:inline distT="0" distB="0" distL="0" distR="0" wp14:anchorId="59A0C5EB" wp14:editId="13E5357A">
+            <wp:extent cx="5943600" cy="1090930"/>
+            <wp:effectExtent l="0" t="0" r="0" b="0"/>
+            <wp:docPr id="2057486041" name="Picture 1"/>
             <wp:cNvGraphicFramePr>
               <a:graphicFrameLocks xmlns:a="http://schemas.openxmlformats.org/drawingml/2006/main" noChangeAspect="1"/>
             </wp:cNvGraphicFramePr>
@@ -2246,7 +2239,7 @@
               <a:graphicData uri="http://schemas.openxmlformats.org/drawingml/2006/picture">
                 <pic:pic xmlns:pic="http://schemas.openxmlformats.org/drawingml/2006/picture">
                   <pic:nvPicPr>
-                    <pic:cNvPr id="157231826" name=""/>
+                    <pic:cNvPr id="2057486041" name=""/>
                     <pic:cNvPicPr/>
                   </pic:nvPicPr>
                   <pic:blipFill>
@@ -2258,7 +2251,7 @@
                   <pic:spPr>
                     <a:xfrm>
                       <a:off x="0" y="0"/>
-                      <a:ext cx="5943600" cy="1199515"/>
+                      <a:ext cx="5943600" cy="1090930"/>
                     </a:xfrm>
                     <a:prstGeom prst="rect">
                       <a:avLst/>
@@ -2308,7 +2301,7 @@
           <w:b/>
           <w:bCs/>
         </w:rPr>
-        <w:t>5</w:t>
+        <w:t>7</w:t>
       </w:r>
       <w:r>
         <w:rPr>
@@ -2329,13 +2322,12 @@
         <w:rPr>
           <w:b/>
           <w:bCs/>
-          <w:noProof/>
         </w:rPr>
         <w:drawing>
-          <wp:inline distT="0" distB="0" distL="0" distR="0" wp14:anchorId="3BDB3786" wp14:editId="557DA238">
-            <wp:extent cx="5943600" cy="1264285"/>
-            <wp:effectExtent l="0" t="0" r="0" b="0"/>
-            <wp:docPr id="1421154077" name="Picture 1"/>
+          <wp:inline distT="0" distB="0" distL="0" distR="0" wp14:anchorId="5970C24B" wp14:editId="04C90AC9">
+            <wp:extent cx="5943600" cy="1214755"/>
+            <wp:effectExtent l="0" t="0" r="0" b="4445"/>
+            <wp:docPr id="881720407" name="Picture 1"/>
             <wp:cNvGraphicFramePr>
               <a:graphicFrameLocks xmlns:a="http://schemas.openxmlformats.org/drawingml/2006/main" noChangeAspect="1"/>
             </wp:cNvGraphicFramePr>
@@ -2343,7 +2335,7 @@
               <a:graphicData uri="http://schemas.openxmlformats.org/drawingml/2006/picture">
                 <pic:pic xmlns:pic="http://schemas.openxmlformats.org/drawingml/2006/picture">
                   <pic:nvPicPr>
-                    <pic:cNvPr id="1421154077" name=""/>
+                    <pic:cNvPr id="881720407" name=""/>
                     <pic:cNvPicPr/>
                   </pic:nvPicPr>
                   <pic:blipFill>
@@ -2355,7 +2347,7 @@
                   <pic:spPr>
                     <a:xfrm>
                       <a:off x="0" y="0"/>
-                      <a:ext cx="5943600" cy="1264285"/>
+                      <a:ext cx="5943600" cy="1214755"/>
                     </a:xfrm>
                     <a:prstGeom prst="rect">
                       <a:avLst/>
@@ -2394,14 +2386,11 @@
     </w:p>
     <w:p>
       <w:r>
-        <w:rPr>
-          <w:noProof/>
-        </w:rPr>
         <w:drawing>
-          <wp:inline distT="0" distB="0" distL="0" distR="0" wp14:anchorId="51F84A81" wp14:editId="2B959946">
-            <wp:extent cx="5943600" cy="1834515"/>
-            <wp:effectExtent l="0" t="0" r="0" b="0"/>
-            <wp:docPr id="616329449" name="Picture 1"/>
+          <wp:inline distT="0" distB="0" distL="0" distR="0" wp14:anchorId="603E2C63" wp14:editId="1A1524B1">
+            <wp:extent cx="5943600" cy="1648460"/>
+            <wp:effectExtent l="0" t="0" r="0" b="8890"/>
+            <wp:docPr id="1765851229" name="Picture 1"/>
             <wp:cNvGraphicFramePr>
               <a:graphicFrameLocks xmlns:a="http://schemas.openxmlformats.org/drawingml/2006/main" noChangeAspect="1"/>
             </wp:cNvGraphicFramePr>
@@ -2409,7 +2398,7 @@
               <a:graphicData uri="http://schemas.openxmlformats.org/drawingml/2006/picture">
                 <pic:pic xmlns:pic="http://schemas.openxmlformats.org/drawingml/2006/picture">
                   <pic:nvPicPr>
-                    <pic:cNvPr id="616329449" name=""/>
+                    <pic:cNvPr id="1765851229" name=""/>
                     <pic:cNvPicPr/>
                   </pic:nvPicPr>
                   <pic:blipFill>
@@ -2421,7 +2410,7 @@
                   <pic:spPr>
                     <a:xfrm>
                       <a:off x="0" y="0"/>
-                      <a:ext cx="5943600" cy="1834515"/>
+                      <a:ext cx="5943600" cy="1648460"/>
                     </a:xfrm>
                     <a:prstGeom prst="rect">
                       <a:avLst/>
@@ -2439,6 +2428,7 @@
     <w:p/>
     <w:p/>
     <w:p/>
+    <w:p/>
     <w:p>
       <w:pPr>
         <w:rPr>
@@ -2462,14 +2452,11 @@
     </w:p>
     <w:p>
       <w:r>
-        <w:rPr>
-          <w:noProof/>
-        </w:rPr>
         <w:drawing>
-          <wp:inline distT="0" distB="0" distL="0" distR="0" wp14:anchorId="6D510747" wp14:editId="68D002FC">
-            <wp:extent cx="5943600" cy="2466340"/>
+          <wp:inline distT="0" distB="0" distL="0" distR="0" wp14:anchorId="5432CCF6" wp14:editId="7AC184FD">
+            <wp:extent cx="5943600" cy="2286635"/>
             <wp:effectExtent l="0" t="0" r="0" b="0"/>
-            <wp:docPr id="28719825" name="Picture 1"/>
+            <wp:docPr id="871904939" name="Picture 1"/>
             <wp:cNvGraphicFramePr>
               <a:graphicFrameLocks xmlns:a="http://schemas.openxmlformats.org/drawingml/2006/main" noChangeAspect="1"/>
             </wp:cNvGraphicFramePr>
@@ -2477,7 +2464,7 @@
               <a:graphicData uri="http://schemas.openxmlformats.org/drawingml/2006/picture">
                 <pic:pic xmlns:pic="http://schemas.openxmlformats.org/drawingml/2006/picture">
                   <pic:nvPicPr>
-                    <pic:cNvPr id="28719825" name=""/>
+                    <pic:cNvPr id="871904939" name=""/>
                     <pic:cNvPicPr/>
                   </pic:nvPicPr>
                   <pic:blipFill>
@@ -2489,7 +2476,7 @@
                   <pic:spPr>
                     <a:xfrm>
                       <a:off x="0" y="0"/>
-                      <a:ext cx="5943600" cy="2466340"/>
+                      <a:ext cx="5943600" cy="2286635"/>
                     </a:xfrm>
                     <a:prstGeom prst="rect">
                       <a:avLst/>
@@ -2529,13 +2516,12 @@
         <w:rPr>
           <w:b/>
           <w:bCs/>
-          <w:noProof/>
         </w:rPr>
         <w:drawing>
-          <wp:inline distT="0" distB="0" distL="0" distR="0" wp14:anchorId="5790554C" wp14:editId="7BF48354">
-            <wp:extent cx="5943600" cy="2776855"/>
-            <wp:effectExtent l="0" t="0" r="0" b="4445"/>
-            <wp:docPr id="1676313249" name="Picture 1"/>
+          <wp:inline distT="0" distB="0" distL="0" distR="0" wp14:anchorId="0FD463B1" wp14:editId="6F0532D7">
+            <wp:extent cx="5943600" cy="2612390"/>
+            <wp:effectExtent l="0" t="0" r="0" b="0"/>
+            <wp:docPr id="482434958" name="Picture 1"/>
             <wp:cNvGraphicFramePr>
               <a:graphicFrameLocks xmlns:a="http://schemas.openxmlformats.org/drawingml/2006/main" noChangeAspect="1"/>
             </wp:cNvGraphicFramePr>
@@ -2543,7 +2529,7 @@
               <a:graphicData uri="http://schemas.openxmlformats.org/drawingml/2006/picture">
                 <pic:pic xmlns:pic="http://schemas.openxmlformats.org/drawingml/2006/picture">
                   <pic:nvPicPr>
-                    <pic:cNvPr id="1676313249" name=""/>
+                    <pic:cNvPr id="482434958" name=""/>
                     <pic:cNvPicPr/>
                   </pic:nvPicPr>
                   <pic:blipFill>
@@ -2555,7 +2541,7 @@
                   <pic:spPr>
                     <a:xfrm>
                       <a:off x="0" y="0"/>
-                      <a:ext cx="5943600" cy="2776855"/>
+                      <a:ext cx="5943600" cy="2612390"/>
                     </a:xfrm>
                     <a:prstGeom prst="rect">
                       <a:avLst/>
@@ -2567,6 +2553,22 @@
           </wp:inline>
         </w:drawing>
       </w:r>
+    </w:p>
+    <w:p>
+      <w:pPr>
+        <w:rPr>
+          <w:b/>
+          <w:bCs/>
+        </w:rPr>
+      </w:pPr>
+    </w:p>
+    <w:p>
+      <w:pPr>
+        <w:rPr>
+          <w:b/>
+          <w:bCs/>
+        </w:rPr>
+      </w:pPr>
     </w:p>
     <w:p>
       <w:pPr>

</xml_diff>